<commit_message>
Complete remaining corrections: reference list, citations, software, geography
- Remove 3 phantom/uncited refs (Fouladi, Fisher, Avery 2014)
- Add 4 missing study refs (Calixto, Diaz, Liu, Millward)
- Renumber all [N] citations in body text (27 old->new mappings)
- Update Para 46 software list (FSL/BrainLab/Analyze -> MNI-DISPLAY/Eclipse TPS)
- Update geographic percentages (NA 50%->39%, EU 28%->36%, Asia 7%->11%)
- Update timeline (approximation methods 2008->2012)
- Final ref count: 31 (was 30)
- All verification checks pass

Audited with Gemini 3 Pro Preview via MCP PAL.
Population percentages (NF1 29%, sporadic 4%, mixed 68%) left unchanged
pending manual verification of each study's population classification.

Co-Authored-By: Claude Opus 4.6 <noreply@anthropic.com>
</commit_message>
<xml_diff>
--- a/Martin_OPG_Volumetric_Review_CORRECTED.docx
+++ b/Martin_OPG_Volumetric_Review_CORRECTED.docx
@@ -711,7 +711,7 @@
           <w:sz w:val="20"/>
           <w:szCs w:val="20"/>
         </w:rPr>
-        <w:t>Volumetric measurement of OPG has emerged as an important tool for surveillance and treatment response assessment, offering advantages over traditional linear measurements that may inadequately capture the irregular, infiltrative growth patterns characteristic of these tumors. The Response Assessment in Pediatric Neuro-Oncology (RAPNO) criteria continue to utilize two-dimensional measurements, yet studies have documented that over 50% of diffuse OPGs cannot be measured using standard methods [12], and 20% discordance exists between 2D and volumetric assessments [13].</w:t>
+        <w:t>Volumetric measurement of OPG has emerged as an important tool for surveillance and treatment response assessment, offering advantages over traditional linear measurements that may inadequately capture the irregular, infiltrative growth patterns characteristic of these tumors. The Response Assessment in Pediatric Neuro-Oncology (RAPNO) criteria continue to utilize two-dimensional measurements, yet studies have documented that over 50% of diffuse OPGs cannot be measured using standard methods [11], and 20% discordance exists between 2D and volumetric assessments [13].</w:t>
       </w:r>
     </w:p>
     <w:p>
@@ -1165,7 +1165,7 @@
           <w:sz w:val="20"/>
           <w:szCs w:val="20"/>
         </w:rPr>
-        <w:t>Included studies were published between 2008 and 2025, with 75% (n=21) published after 2015. Geographic distribution included North America (50%), Europe (28%), Middle East (11%), Asia (7%), and South America (4%). Sample sizes ranged from 3 to 186 patients. Populations included NF1-associated OPG (29%), sporadic OPG (4%), and mixed (68%). MRI protocols varied across studies; most employed T1-weighted post-contrast sequences for volumetric analysis, though T2/FLAIR sequences were used in contrast-free surveillance protocols.</w:t>
+        <w:t>Included studies were published between 2008 and 2025, with 75% (n=21) published after 2015. Geographic distribution included North America (39%), Europe (36%), Middle East (11%), Asia (11%), and South America (4%). Sample sizes ranged from 3 to 186 patients. Populations included NF1-associated OPG (29%), sporadic OPG (4%), and mixed (68%). MRI protocols varied across studies; most employed T1-weighted post-contrast sequences for volumetric analysis, though T2/FLAIR sequences were used in contrast-free surveillance protocols.</w:t>
       </w:r>
     </w:p>
     <w:p>
@@ -1237,7 +1237,7 @@
           <w:sz w:val="20"/>
           <w:szCs w:val="20"/>
         </w:rPr>
-        <w:t xml:space="preserve"> (n=8, 31%): Slice-by-slice delineation using open-source platforms (3D Slicer, ITK-SNAP, Horos, FSL) or commercial software (BrainLab, Analyze)</w:t>
+        <w:t xml:space="preserve"> (n=8, 31%): Slice-by-slice delineation using open-source platforms (3D Slicer, ITK-SNAP, Horos, MNI-DISPLAY) or commercial software (Eclipse TPS)</w:t>
       </w:r>
     </w:p>
     <w:p>
@@ -1361,7 +1361,7 @@
           <w:sz w:val="20"/>
           <w:szCs w:val="20"/>
         </w:rPr>
-        <w:t>Methodological approaches evolved over time (Table 1): approximation methods predominated 2008–2013, semi-automated approaches emerged 2014–2018, and the two deep learning studies appeared 2022–2023.</w:t>
+        <w:t>Methodological approaches evolved over time (Table 1): approximation methods predominated 2012–2013, semi-automated approaches emerged 2014–2018, and the two deep learning studies appeared 2022–2023.</w:t>
       </w:r>
     </w:p>
     <w:p>
@@ -1403,7 +1403,7 @@
           <w:sz w:val="20"/>
           <w:szCs w:val="20"/>
         </w:rPr>
-        <w:t xml:space="preserve">Only 5 of 28 studies (18%) reported inter-rater reliability (Table 2). Reported metrics included: ICC 0.96 [10], Kappa 0.87 [24], Kappa 0.47–0.69 [23], Kappa 0.56–1.0 post-standardization [21], and ICC 0.998–1.000 for </w:t>
+        <w:t xml:space="preserve">Only 5 of 28 studies (18%) reported inter-rater reliability (Table 2). Reported metrics included: ICC 0.96 [9], Kappa 0.87 [24], Kappa 0.47–0.69 [23], Kappa 0.56–1.0 post-standardization [20], and ICC 0.998–1.000 for </w:t>
       </w:r>
       <w:r>
         <w:rPr>
@@ -1431,7 +1431,7 @@
           <w:sz w:val="20"/>
           <w:szCs w:val="20"/>
         </w:rPr>
-        <w:t xml:space="preserve"> measurements [29]. Notably, Lambron et al. [21] demonstrated improvement across multiple tumor characteristics from unacceptable pre-standardization reliability (Kappa </w:t>
+        <w:t xml:space="preserve"> measurements [30]. Notably, Lambron et al. [20] demonstrated improvement across multiple tumor characteristics from unacceptable pre-standardization reliability (Kappa </w:t>
       </w:r>
       <w:r>
         <w:rPr>
@@ -1511,7 +1511,7 @@
           <w:sz w:val="20"/>
           <w:szCs w:val="20"/>
         </w:rPr>
-        <w:t xml:space="preserve"> Visual acuity loss detection (sensitivity 87%, specificity 90%; validated across 2 institutions using different MRI platforms) [7,8]</w:t>
+        <w:t xml:space="preserve"> Visual acuity loss detection (sensitivity 87%, specificity 90%; validated across 2 institutions using different MRI platforms) [6,7]</w:t>
       </w:r>
     </w:p>
     <w:p>
@@ -1541,7 +1541,7 @@
           <w:sz w:val="20"/>
           <w:szCs w:val="20"/>
         </w:rPr>
-        <w:t xml:space="preserve"> Abnormal RNFL prediction (PPV 87%) [4]</w:t>
+        <w:t xml:space="preserve"> Abnormal RNFL prediction (PPV 87%) [3]</w:t>
       </w:r>
     </w:p>
     <w:p>
@@ -1571,7 +1571,7 @@
           <w:sz w:val="20"/>
           <w:szCs w:val="20"/>
         </w:rPr>
-        <w:t xml:space="preserve"> Abnormal RNFL prediction (PPV 100%) [4]</w:t>
+        <w:t xml:space="preserve"> Abnormal RNFL prediction (PPV 100%) [3]</w:t>
       </w:r>
     </w:p>
     <w:p>
@@ -1601,7 +1601,7 @@
           <w:sz w:val="20"/>
           <w:szCs w:val="20"/>
         </w:rPr>
-        <w:t xml:space="preserve"> Visual acuity deterioration (AUC 0.81) [16]</w:t>
+        <w:t xml:space="preserve"> Visual acuity deterioration (AUC 0.81) [15]</w:t>
       </w:r>
     </w:p>
     <w:p>
@@ -1631,7 +1631,7 @@
           <w:sz w:val="20"/>
           <w:szCs w:val="20"/>
         </w:rPr>
-        <w:t xml:space="preserve"> Impaired VA at diagnosis (AUC 0.78) [16]</w:t>
+        <w:t xml:space="preserve"> Impaired VA at diagnosis (AUC 0.78) [15]</w:t>
       </w:r>
     </w:p>
     <w:p>
@@ -1661,7 +1661,7 @@
           <w:sz w:val="20"/>
           <w:szCs w:val="20"/>
         </w:rPr>
-        <w:t xml:space="preserve"> Visual acuity decrease prediction (AUC 0.76) [16]</w:t>
+        <w:t xml:space="preserve"> Visual acuity decrease prediction (AUC 0.76) [15]</w:t>
       </w:r>
     </w:p>
     <w:p>
@@ -1712,7 +1712,7 @@
           <w:sz w:val="20"/>
           <w:szCs w:val="20"/>
         </w:rPr>
-        <w:t xml:space="preserve"> Strong inverse correlations were consistently demonstrated: rs = -0.939 [9], -5.34 μm per 1 mL AVP increase [7].</w:t>
+        <w:t xml:space="preserve"> Strong inverse correlations were consistently demonstrated: rs = -0.939 [8], -5.34 μm per 1 mL AVP increase [6].</w:t>
       </w:r>
     </w:p>
     <w:p>
@@ -1738,7 +1738,7 @@
           <w:sz w:val="20"/>
           <w:szCs w:val="20"/>
         </w:rPr>
-        <w:t xml:space="preserve"> In contrast, volume-VA correlations were weak or absent: r = 0.0 between volume change and VA change [18], rs = 0.065 (p = 0.809) for volume-VA correlation [9]. This finding was replicated across multiple independent studies.</w:t>
+        <w:t xml:space="preserve"> In contrast, volume-VA correlations were weak or absent: r = 0.0 between volume change and VA change [17], rs = 0.065 (p = 0.809) for volume-VA correlation [8]. This finding was replicated across multiple independent studies.</w:t>
       </w:r>
     </w:p>
     <w:p>
@@ -1764,7 +1764,7 @@
           <w:sz w:val="20"/>
           <w:szCs w:val="20"/>
         </w:rPr>
-        <w:t xml:space="preserve"> The relationship between volume and outcomes differed by NF1 status. Gorodezki et al. [16] found tumor growth velocity correlated more strongly with visual outcomes in sporadic OPG than NF1-associated tumors. Kilian et al. [20] demonstrated that optic nerve width was a better predictor than total tumor volume specifically in NF1-associated OPG, suggesting component-specific measurement may be particularly important in this population.</w:t>
+        <w:t xml:space="preserve"> The relationship between volume and outcomes differed by NF1 status. Gorodezki et al. [15] found tumor growth velocity correlated more strongly with visual outcomes in sporadic OPG than NF1-associated tumors. Kilian et al. [19] demonstrated that optic nerve width was a better predictor than total tumor volume specifically in NF1-associated OPG, suggesting component-specific measurement may be particularly important in this population.</w:t>
       </w:r>
     </w:p>
     <w:p>
@@ -1947,7 +1947,7 @@
           <w:sz w:val="20"/>
           <w:szCs w:val="20"/>
         </w:rPr>
-        <w:t>[17]. However, these results derive from internal validation on a single dataset (n=75); external validation across institutions and imaging protocols remains lacking. Clinical adoption faces additional barriers including limited pediatric training data, lack of prospective validation, and the “algorithm versioning” challenge—reproducibility applies only within a given algorithm version, complicating longitudinal comparisons when models are updated.</w:t>
+        <w:t>[16]. However, these results derive from internal validation on a single dataset (n=75); external validation across institutions and imaging protocols remains lacking. Clinical adoption faces additional barriers including limited pediatric training data, lack of prospective validation, and the “algorithm versioning” challenge—reproducibility applies only within a given algorithm version, complicating longitudinal comparisons when models are updated.</w:t>
       </w:r>
     </w:p>
     <w:p>
@@ -1989,7 +1989,7 @@
           <w:sz w:val="20"/>
           <w:szCs w:val="20"/>
         </w:rPr>
-        <w:t xml:space="preserve">The finding that only 18% of studies reported reliability metrics is concerning. Without established benchmarks, clinicians cannot assess whether observed volume changes represent true progression or measurement variability. Lambron et al. [21] demonstrated that a standardized interpretation protocol—including defined radioanatomical landmarks, consistent measurement procedures, and training </w:t>
+        <w:t xml:space="preserve">The finding that only 18% of studies reported reliability metrics is concerning. Without established benchmarks, clinicians cannot assess whether observed volume changes represent true progression or measurement variability. Lambron et al. [20] demonstrated that a standardized interpretation protocol—including defined radioanatomical landmarks, consistent measurement procedures, and training </w:t>
       </w:r>
       <w:r>
         <w:rPr>
@@ -2060,14 +2060,14 @@
           <w:sz w:val="20"/>
           <w:szCs w:val="20"/>
         </w:rPr>
-        <w:t>Tumor volume correlates strongly with RNFL thickness (rs = -0.939, n=16 [9]), but correlations with visual acuity were weak or non-significant across multiple studies (r = 0.0, n=42 [18]; rs = 0.065, p = 0.809, n=16 [9]). While these findings derive from different study populations—limiting direct comparison—the pattern was consistent across multiple independent cohorts. This dissociation challenges the implicit clinical assumption that tumor shrinkage should translate to visual improvement, an expectation that underlies volumetric response criteria. Kelly et al. [18] directly tested this in 42 patients: tumor shrinkage following treatment showed no significant correlation with visual improvement (r = 0.0, p = 0.5). Several factors may explain this pattern: visual acuity primarily reflects foveal function while RNFL measures global retinal ganglion cell integrity; measurement variability in pediatric visual acuity testing introduces noise</w:t>
-      </w:r>
-      <w:r>
-        <w:rPr>
-          <w:sz w:val="20"/>
-          <w:szCs w:val="20"/>
-        </w:rPr>
-        <w:t xml:space="preserve"> [6]</w:t>
+        <w:t>Tumor volume correlates strongly with RNFL thickness (rs = -0.939, n=16 [8]), but correlations with visual acuity were weak or non-significant across multiple studies (r = 0.0, n=42 [17]; rs = 0.065, p = 0.809, n=16 [8]). While these findings derive from different study populations—limiting direct comparison—the pattern was consistent across multiple independent cohorts. This dissociation challenges the implicit clinical assumption that tumor shrinkage should translate to visual improvement, an expectation that underlies volumetric response criteria. Kelly et al. [17] directly tested this in 42 patients: tumor shrinkage following treatment showed no significant correlation with visual improvement (r = 0.0, p = 0.5). Several factors may explain this pattern: visual acuity primarily reflects foveal function while RNFL measures global retinal ganglion cell integrity; measurement variability in pediatric visual acuity testing introduces noise</w:t>
+      </w:r>
+      <w:r>
+        <w:rPr>
+          <w:sz w:val="20"/>
+          <w:szCs w:val="20"/>
+        </w:rPr>
+        <w:t xml:space="preserve"> [5]</w:t>
       </w:r>
       <w:r>
         <w:rPr>
@@ -2130,7 +2130,7 @@
           <w:sz w:val="20"/>
           <w:szCs w:val="20"/>
         </w:rPr>
-        <w:t xml:space="preserve">), and external validation is lacking. The Avery studies [7,8] validated the AVP &gt;1.75 mL threshold across two institutions, providing the strongest evidence, though both cohorts were NF1-only populations. Threshold derivation and validation within the same dataset risks overfitting, particularly for the Gorodezki thresholds [16] which reported multiple cut points (&gt;0.1 cm³/month, &gt;4.0 cm³, &gt;11.1 cm³) from a single cohort of </w:t>
+        <w:t xml:space="preserve">), and external validation is lacking. The Avery studies [6,7] validated the AVP &gt;1.75 mL threshold across two institutions, providing the strongest evidence, though both cohorts were NF1-only populations. Threshold derivation and validation within the same dataset risks overfitting, particularly for the Gorodezki thresholds [15] which reported multiple cut points (&gt;0.1 cm³/month, &gt;4.0 cm³, &gt;11.1 cm³) from a single cohort of </w:t>
       </w:r>
       <w:r>
         <w:rPr>
@@ -2144,7 +2144,7 @@
           <w:sz w:val="20"/>
           <w:szCs w:val="20"/>
         </w:rPr>
-        <w:t xml:space="preserve"> patients. Additionally, positive and negative predictive values are prevalence-dependent; the reported PPV of 87-100% for RNFL abnormality [4] applies specifically to NF1 populations with high baseline OPG prevalence and may not generalize to sporadic cases or screening contexts. Prospective multicenter validation is essential before clinical implementation.</w:t>
+        <w:t xml:space="preserve"> patients. Additionally, positive and negative predictive values are prevalence-dependent; the reported PPV of 87-100% for RNFL abnormality [3] applies specifically to NF1 populations with high baseline OPG prevalence and may not generalize to sporadic cases or screening contexts. Prospective multicenter validation is essential before clinical implementation.</w:t>
       </w:r>
     </w:p>
     <w:p>
@@ -2196,7 +2196,7 @@
           <w:sz w:val="20"/>
           <w:szCs w:val="20"/>
         </w:rPr>
-        <w:t>The adoption of volumetric measurement in clinical practice requires careful consideration of resource allocation and workflow integration. Manual segmentation, while accessible using free software platforms such as 3D Slicer, ITK-SNAP, Horos, and FSL, demands substantial operator training and quality assurance protocols to achieve high inter-rater reliability (e.g., ICC &gt;0.90) [10]. For small centers managing fewer than 20 OPG patients annually, this approach remains feasible when paired with standardized protocols such as the Lambron method [21], which provides explicit radioanatomical landmarks, consistent measurement procedures, and training requirements that improved consistency, raising inter-rater agreement from a highly variable Kappa range of 0.11–1.0 to a more reliable 0.56–1.0 across multiple tumor characteristics. Conversely, large academic centers and multi-institutional trials may justify investment in semi-automated approaches or AI-assisted segmentation to improve efficiency [17,26], though these approaches introduce algorithm versioning challenges and require prospective external validation before clinical deployment.</w:t>
+        <w:t>The adoption of volumetric measurement in clinical practice requires careful consideration of resource allocation and workflow integration. Manual segmentation, while accessible using free software platforms such as 3D Slicer, ITK-SNAP, Horos, and FSL, demands substantial operator training and quality assurance protocols to achieve high inter-rater reliability (e.g., ICC &gt;0.90) [9]. For small centers managing fewer than 20 OPG patients annually, this approach remains feasible when paired with standardized protocols such as the Lambron method [20], which provides explicit radioanatomical landmarks, consistent measurement procedures, and training requirements that improved consistency, raising inter-rater agreement from a highly variable Kappa range of 0.11–1.0 to a more reliable 0.56–1.0 across multiple tumor characteristics. Conversely, large academic centers and multi-institutional trials may justify investment in semi-automated approaches or AI-assisted segmentation to improve efficiency [16,27], though these approaches introduce algorithm versioning challenges and require prospective external validation before clinical deployment.</w:t>
       </w:r>
     </w:p>
     <w:p>
@@ -2213,7 +2213,7 @@
           <w:sz w:val="20"/>
           <w:szCs w:val="20"/>
         </w:rPr>
-        <w:t>Clinical surveillance programs occupy an intermediate position, where volumetric monitoring may detect growth patterns such as tumor growth velocity exceeding 0.1 cm³/month (AUC 0.81 for visual acuity deterioration) [16] that could potentially predict deterioration earlier than conventional 2D measurements.</w:t>
+        <w:t>Clinical surveillance programs occupy an intermediate position, where volumetric monitoring may detect growth patterns such as tumor growth velocity exceeding 0.1 cm³/month (AUC 0.81 for visual acuity deterioration) [15] that could potentially predict deterioration earlier than conventional 2D measurements.</w:t>
       </w:r>
     </w:p>
     <w:p>
@@ -2241,15 +2241,14 @@
           <w:sz w:val="20"/>
           <w:szCs w:val="20"/>
         </w:rPr>
-        <w:t xml:space="preserve">Volumetric biomarkers should complement, rather than replace, existing neuro-ophthalmologic assessment. At initial diagnosis, anterior visual pathway volume exceeding 1.75 mL identifies patients at elevated risk for visual acuity deterioration (sensitivity 87%, specificity 90%), validated across two institutions using different MRI platforms [7,8]. During active surveillance, tumor growth velocity quantifies disease trajectory with superior specificity compared to static volume measurements [16]. However, the documented dissociation between tumor volume changes and visual function outcomes [18]—with volume change showing no correlation with visual acuity change (r = 0.0, p = 0.5)—necessitates parallel monitoring of retinal nerve fiber layer thickness [9] and formal visual field testing. Integration of volumetric metrics into existing response assessment frameworks (e.g., RAPNO criteria) remains aspirational pending </w:t>
-      </w:r>
-      <w:r>
-        <w:rPr>
-          <w:sz w:val="20"/>
-          <w:szCs w:val="20"/>
-        </w:rPr>
-        <w:lastRenderedPageBreak/>
-        <w:t>prospective validation, particularly for diffuse chiasmatic tumors where conventional 2D measurements demonstrate 20% discordance with volumetric assessment [13]. NF1-associated OPGs exhibit distinct natural history patterns [16,20], suggesting that prognostic thresholds validated in sporadic tumors may require recalibration for this population.</w:t>
+        <w:t xml:space="preserve">Volumetric biomarkers should complement, rather than replace, existing neuro-ophthalmologic assessment. At initial diagnosis, anterior visual pathway volume exceeding 1.75 mL identifies patients at elevated risk for visual acuity deterioration (sensitivity 87%, specificity 90%), validated across two institutions using different MRI platforms [6,7]. During active surveillance, tumor growth velocity quantifies disease trajectory with superior specificity compared to static volume measurements [15]. However, the documented dissociation between tumor volume changes and visual function outcomes [17]—with volume change showing no correlation with visual acuity change (r = 0.0, p = 0.5)—necessitates parallel monitoring of retinal nerve fiber layer thickness [8] and formal visual field testing. Integration of volumetric metrics into existing response assessment frameworks (e.g., RAPNO criteria) remains aspirational pending </w:t>
+      </w:r>
+      <w:r>
+        <w:rPr>
+          <w:sz w:val="20"/>
+          <w:szCs w:val="20"/>
+        </w:rPr>
+        <w:t>prospective validation, particularly for diffuse chiasmatic tumors where conventional 2D measurements demonstrate 20% discordance with volumetric assessment [13]. NF1-associated OPGs exhibit distinct natural history patterns [15,19], suggesting that prognostic thresholds validated in sporadic tumors may require recalibration for this population.</w:t>
       </w:r>
     </w:p>
     <w:p>
@@ -2795,7 +2794,7 @@
           <w:sz w:val="20"/>
           <w:szCs w:val="20"/>
         </w:rPr>
-        <w:t>Avery RA, Hwang EI, Jakacki RI, Packer RJ. Marked recovery of vision in children with optic pathway gliomas treated with bevacizumab. JAMA Ophthalmol. 2014;132(1):111-4.</w:t>
+        <w:t>Avery RA, Cnaan A, Schuman JS, et al. Optic pathway glioma volume predicts retinal axon degeneration in neurofibromatosis type 1. Neurology. 2016;87(21):2221-9.</w:t>
       </w:r>
     </w:p>
     <w:p>
@@ -2816,7 +2815,7 @@
           <w:sz w:val="20"/>
           <w:szCs w:val="20"/>
         </w:rPr>
-        <w:t>Avery RA, Cnaan A, Schuman JS, et al. Optic pathway glioma volume predicts retinal axon degeneration in neurofibromatosis type 1. Neurology. 2016;87(21):2221-9.</w:t>
+        <w:t>Avery RA, Cnaan A, Schuman JS, et al. Quantitative MRI criteria for optic pathway enlargement in neurofibromatosis type 1. Neurology. 2016;86(24):2264-70.</w:t>
       </w:r>
     </w:p>
     <w:p>
@@ -2837,7 +2836,7 @@
           <w:sz w:val="20"/>
           <w:szCs w:val="20"/>
         </w:rPr>
-        <w:t>Avery RA, Cnaan A, Schuman JS, et al. Quantitative MRI criteria for optic pathway enlargement in neurofibromatosis type 1. Neurology. 2016;86(24):2264-70.</w:t>
+        <w:t>Avery RA, Bouffet E, Packer RJ, Reginald A. Feasibility and comparison of visual acuity testing methods in children with neurofibromatosis type 1 and/or optic pathway gliomas. Invest Ophthalmol Vis Sci. 2013;54(2):1034-8.</w:t>
       </w:r>
     </w:p>
     <w:p>
@@ -2858,7 +2857,7 @@
           <w:sz w:val="20"/>
           <w:szCs w:val="20"/>
         </w:rPr>
-        <w:t>Avery RA, Bouffet E, Packer RJ, Reginald A. Feasibility and comparison of visual acuity testing methods in children with neurofibromatosis type 1 and/or optic pathway gliomas. Invest Ophthalmol Vis Sci. 2013;54(2):1034-8.</w:t>
+        <w:t>Avery RA, Stence NV, Engel MA, et al. Larger tumor volume associated with worse visual acuity at diagnosis in children with optic pathway gliomas and neurofibromatosis type 1. Neuro Oncol Adv. 2023;5(1):vdad107.</w:t>
       </w:r>
     </w:p>
     <w:p>
@@ -2879,7 +2878,7 @@
           <w:sz w:val="20"/>
           <w:szCs w:val="20"/>
         </w:rPr>
-        <w:t>Avery RA, Stence NV, Engel MA, et al. Larger tumor volume associated with worse visual acuity at diagnosis in children with optic pathway gliomas and neurofibromatosis type 1. Neuro Oncol Adv. 2023;5(1):vdad107.</w:t>
+        <w:t>Avery RA, Mansoor A, Engel MA, et al. Optic pathway glioma volume predicts visual acuity loss and axonal loss in children with neurofibromatosis type 1. Neuro Oncol. 2018;20(Suppl 2):i105.</w:t>
       </w:r>
     </w:p>
     <w:p>
@@ -2900,7 +2899,7 @@
           <w:sz w:val="20"/>
           <w:szCs w:val="20"/>
         </w:rPr>
-        <w:t>Avery RA, Mansoor A, Engel MA, et al. Optic pathway glioma volume predicts visual acuity loss and axonal loss in children with neurofibromatosis type 1. Neuro Oncol. 2018;20(Suppl 2):i105.</w:t>
+        <w:t>Alshowaeir D, Al-Sakkaf H, Alwehaib A, Altwijri R, Almandeel N, Almutawa A, et al. Correlation between retinal nerve fibre layer thickness and tumour volume in patients with optic pathway gliomas. Int Ophthalmol. 2025;45:288. doi:10.1007/s10792-025-03676-2</w:t>
       </w:r>
     </w:p>
     <w:p>
@@ -2921,7 +2920,7 @@
           <w:sz w:val="20"/>
           <w:szCs w:val="20"/>
         </w:rPr>
-        <w:t>Alshowaeir D, Al-Sakkaf H, Alwehaib A, Altwijri R, Almandeel N, Almutawa A, et al. Correlation between retinal nerve fibre layer thickness and tumour volume in patients with optic pathway gliomas. Int Ophthalmol. 2025;45:288. doi:10.1007/s10792-025-03676-2</w:t>
+        <w:t>Bennebroek CAM, Hoffmann DM, Bouckaert K, et al. Treatment evaluation by volumetric segmentation in pediatric optic pathway glioma. J Neurooncol. 2024;166(1):107-16.</w:t>
       </w:r>
     </w:p>
     <w:p>
@@ -2942,7 +2941,7 @@
           <w:sz w:val="20"/>
           <w:szCs w:val="20"/>
         </w:rPr>
-        <w:t>Bennebroek CAM, Hoffmann DM, Bouckaert K, et al. Treatment evaluation by volumetric segmentation in pediatric optic pathway glioma. J Neurooncol. 2024;166(1):107-16.</w:t>
+        <w:t>Bennebroek CAM, de Graaf P, Castelijns JA, et al. Treatment of isolated pediatric optic nerve glioma. Pediatr Blood Cancer. 2024;71(12):e31358.</w:t>
       </w:r>
     </w:p>
     <w:p>
@@ -2963,7 +2962,7 @@
           <w:sz w:val="20"/>
           <w:szCs w:val="20"/>
         </w:rPr>
-        <w:t>Bennebroek CAM, de Graaf P, Castelijns JA, et al. Treatment of isolated pediatric optic nerve glioma. Pediatr Blood Cancer. 2024;71(12):e31358.</w:t>
+        <w:t>Bennebroek CAM, van Zanten GA, Schakel IM, et al. Bevacizumab treatment effects on visual function and tumor size in optic pathway glioma. Cancers (Basel). 2022;14(24):6087.</w:t>
       </w:r>
     </w:p>
     <w:p>
@@ -2984,8 +2983,7 @@
           <w:sz w:val="20"/>
           <w:szCs w:val="20"/>
         </w:rPr>
-        <w:lastRenderedPageBreak/>
-        <w:t>Bennebroek CAM, van Zanten GA, Schakel IM, et al. Bevacizumab treatment effects on visual function and tumor size in optic pathway glioma. Cancers (Basel). 2022;14(24):6087.</w:t>
+        <w:t>Calixto EL, Ono SE, Teixeira BCAT, et al. Monitoring optochiasmatic-hypothalamic glioma volumetric changes by MRI in children under clinical surveillance or chemotherapy. Childs Nerv Syst. 2019;35(1):63-72.</w:t>
       </w:r>
     </w:p>
     <w:p>
@@ -3027,7 +3025,7 @@
           <w:sz w:val="20"/>
           <w:szCs w:val="20"/>
         </w:rPr>
-        <w:t>Fouladi M, Hunt DL, Pollack IF, et al. Outcome of children with centrally reviewed low-grade gliomas treated with chemotherapy. Neurology. 2003;60(8):1274-9.</w:t>
+        <w:t>Diaz RJ, Laughlin S, Nicolin G, Bouffet E. Assessment of chemotherapeutic response in children with proptosis due to optic nerve glioma. Childs Nerv Syst. 2008;24(6):707-12.</w:t>
       </w:r>
     </w:p>
     <w:p>
@@ -3048,7 +3046,7 @@
           <w:sz w:val="20"/>
           <w:szCs w:val="20"/>
         </w:rPr>
-        <w:t>Fisher MJ, Loguidice M, Gutmann DH, et al. Visual outcomes in children with neurofibromatosis type 1-associated optic pathway glioma following chemotherapy. Neuro Oncol. 2012;14(6):788-94.</w:t>
+        <w:t>Gorodezki D, Schuhmann MU, Ebinger M, Krauss J. MRI-based 3D tumor burden and growth velocity for visual acuity prediction in optic pathway glioma. Childs Nerv Syst. 2025;41(1):89.</w:t>
       </w:r>
     </w:p>
     <w:p>
@@ -3069,7 +3067,7 @@
           <w:sz w:val="20"/>
           <w:szCs w:val="20"/>
         </w:rPr>
-        <w:t>Gorodezki D, Schuhmann MU, Ebinger M, Krauss J. MRI-based 3D tumor burden and growth velocity for visual acuity prediction in optic pathway glioma. Childs Nerv Syst. 2025;41(1):89.</w:t>
+        <w:t>Jiang Q, Liu Y, Li L, et al. Automatic visual acuity loss prediction in children with optic pathway glioma using MRI. Annu Int Conf IEEE Eng Med Biol Soc. 2023;2023:1-4.</w:t>
       </w:r>
     </w:p>
     <w:p>
@@ -3090,7 +3088,7 @@
           <w:sz w:val="20"/>
           <w:szCs w:val="20"/>
         </w:rPr>
-        <w:t>Jiang Q, Liu Y, Li L, et al. Automatic visual acuity loss prediction in children with optic pathway glioma using MRI. Annu Int Conf IEEE Eng Med Biol Soc. 2023;2023:1-4.</w:t>
+        <w:t>Kelly KR, McKetton L, Bhardwaj S, et al. Longitudinal measures of visual function, tumor volume, and prediction of visual outcomes after treatment of optic pathway gliomas. Ophthalmology. 2012;119(6):1213-9.</w:t>
       </w:r>
     </w:p>
     <w:p>
@@ -3111,7 +3109,7 @@
           <w:sz w:val="20"/>
           <w:szCs w:val="20"/>
         </w:rPr>
-        <w:t>Kelly KR, McKetton L, Bhardwaj S, et al. Longitudinal measures of visual function, tumor volume, and prediction of visual outcomes after treatment of optic pathway gliomas. Ophthalmology. 2012;119(6):1213-9.</w:t>
+        <w:t>Kelly KR, McKetton L, Bhardwaj S, et al. Detection of tumor progression in optic pathway glioma: development and validation of a biomarker. Neuro Oncol. 2013;15(11):1473-81.</w:t>
       </w:r>
     </w:p>
     <w:p>
@@ -3132,7 +3130,7 @@
           <w:sz w:val="20"/>
           <w:szCs w:val="20"/>
         </w:rPr>
-        <w:t>Kelly KR, McKetton L, Bhardwaj S, et al. Detection of tumor progression in optic pathway glioma: development and validation of a biomarker. Neuro Oncol. 2013;15(11):1473-81.</w:t>
+        <w:t>Kilian T, Gutmann DH, Jilg C, et al. Tumor load versus contrast enhancement as risk factors for optic pathway glioma progression. J Neurooncol. 2022;156(2):347-55.</w:t>
       </w:r>
     </w:p>
     <w:p>
@@ -3153,7 +3151,7 @@
           <w:sz w:val="20"/>
           <w:szCs w:val="20"/>
         </w:rPr>
-        <w:t>Kilian T, Gutmann DH, Jilg C, et al. Tumor load versus contrast enhancement as risk factors for optic pathway glioma progression. J Neurooncol. 2022;156(2):347-55.</w:t>
+        <w:t>Lambron J, Fernandez C, Perot G, et al. Can we improve accuracy and reliability of MRI interpretation in children with optic pathway glioma? Proposal for a reproducible imaging classification. Neuroradiology. 2016;58(2):197-208. doi:10.1007/s00234-015-1612-7</w:t>
       </w:r>
     </w:p>
     <w:p>
@@ -3174,7 +3172,7 @@
           <w:sz w:val="20"/>
           <w:szCs w:val="20"/>
         </w:rPr>
-        <w:t>Lambron J, Fernandez C, Perot G, et al. Can we improve accuracy and reliability of MRI interpretation in children with optic pathway glioma? Proposal for a reproducible imaging classification. Neuroradiology. 2016;58(2):197-208. doi:10.1007/s00234-015-1612-7</w:t>
+        <w:t>Liu Z, Ding Z, Zhang J, et al. The role of imaging features and resection status in the survival outcome of sporadic optic pathway glioma children. Neurosurg Rev. 2022;45(3):2277-87.</w:t>
       </w:r>
     </w:p>
     <w:p>
@@ -3216,7 +3214,6 @@
           <w:sz w:val="20"/>
           <w:szCs w:val="20"/>
         </w:rPr>
-        <w:lastRenderedPageBreak/>
         <w:t>Maloney E, Schill EM, Gross A, et al. Non-inferiority of a non-gadolinium-enhanced MRI follow-up protocol for isolated optic pathway glioma. Pediatr Radiol. 2021;51(13):2457-65.</w:t>
       </w:r>
     </w:p>
@@ -3239,6 +3236,27 @@
           <w:szCs w:val="20"/>
         </w:rPr>
         <w:t>Marsault R, Boddaert N, Dufour C, et al. Diagnostic performance of unenhanced MRI for follow-up of optic pathway glioma. Neuroradiology. 2019;61(8):897-905.</w:t>
+      </w:r>
+    </w:p>
+    <w:p>
+      <w:pPr>
+        <w:pStyle w:val="Compact"/>
+        <w:numPr>
+          <w:ilvl w:val="0"/>
+          <w:numId w:val="4"/>
+        </w:numPr>
+        <w:spacing w:line="480" w:lineRule="auto"/>
+        <w:rPr>
+          <w:sz w:val="20"/>
+          <w:szCs w:val="20"/>
+        </w:rPr>
+      </w:pPr>
+      <w:r>
+        <w:rPr>
+          <w:sz w:val="20"/>
+          <w:szCs w:val="20"/>
+        </w:rPr>
+        <w:t>Millward CP, Perez da Rosa S, Avula S, et al. The role of early intra-operative MRI in partial resection of optic pathway/hypothalamic gliomas in children. Childs Nerv Syst. 2015;31(11):2055-62.</w:t>
       </w:r>
     </w:p>
     <w:p>

</xml_diff>

<commit_message>
Fix cross-table consistency and citation errors
- S1 Maloney (2021): "Manual" → "Approximation" (matches Table 1 and body text)
- S1 Kelly (2012): software "N/A" → "ITK-SNAP" (matches Table 1)
- Para 80: "FSL" → "MNI-DISPLAY" (matches Para 46 methods list)
- Para 72: [16] → [16,26] (added Nalepa/nnU-Net to automated methods citation)
- Para 53: ICC 0.96 [9] → [10] (corrected: Bennebroek 2024b, not 2024a)

Co-Authored-By: Claude Opus 4.6 <noreply@anthropic.com>
</commit_message>
<xml_diff>
--- a/Martin_OPG_Volumetric_Review_CORRECTED.docx
+++ b/Martin_OPG_Volumetric_Review_CORRECTED.docx
@@ -1403,7 +1403,7 @@
           <w:sz w:val="20"/>
           <w:szCs w:val="20"/>
         </w:rPr>
-        <w:t xml:space="preserve">Only 5 of 28 studies (18%) reported inter-rater reliability (Table 2). Reported metrics included: ICC 0.96 [9], Kappa 0.87 [24], Kappa 0.47–0.69 [23], Kappa 0.56–1.0 post-standardization [20], and ICC 0.998–1.000 for </w:t>
+        <w:t xml:space="preserve">Only 5 of 28 studies (18%) reported inter-rater reliability (Table 2). Reported metrics included: ICC 0.96 [10], Kappa 0.87 [24], Kappa 0.47–0.69 [23], Kappa 0.56–1.0 post-standardization [20], and ICC 0.998–1.000 for </w:t>
       </w:r>
       <w:r>
         <w:rPr>
@@ -1947,7 +1947,7 @@
           <w:sz w:val="20"/>
           <w:szCs w:val="20"/>
         </w:rPr>
-        <w:t>[16]. However, these results derive from internal validation on a single dataset (n=75); external validation across institutions and imaging protocols remains lacking. Clinical adoption faces additional barriers including limited pediatric training data, lack of prospective validation, and the “algorithm versioning” challenge—reproducibility applies only within a given algorithm version, complicating longitudinal comparisons when models are updated.</w:t>
+        <w:t>[16,26]. However, these results derive from internal validation on a single dataset (n=75); external validation across institutions and imaging protocols remains lacking. Clinical adoption faces additional barriers including limited pediatric training data, lack of prospective validation, and the “algorithm versioning” challenge—reproducibility applies only within a given algorithm version, complicating longitudinal comparisons when models are updated.</w:t>
       </w:r>
     </w:p>
     <w:p>
@@ -2196,7 +2196,7 @@
           <w:sz w:val="20"/>
           <w:szCs w:val="20"/>
         </w:rPr>
-        <w:t>The adoption of volumetric measurement in clinical practice requires careful consideration of resource allocation and workflow integration. Manual segmentation, while accessible using free software platforms such as 3D Slicer, ITK-SNAP, Horos, and FSL, demands substantial operator training and quality assurance protocols to achieve high inter-rater reliability (e.g., ICC &gt;0.90) [9]. For small centers managing fewer than 20 OPG patients annually, this approach remains feasible when paired with standardized protocols such as the Lambron method [20], which provides explicit radioanatomical landmarks, consistent measurement procedures, and training requirements that improved consistency, raising inter-rater agreement from a highly variable Kappa range of 0.11–1.0 to a more reliable 0.56–1.0 across multiple tumor characteristics. Conversely, large academic centers and multi-institutional trials may justify investment in semi-automated approaches or AI-assisted segmentation to improve efficiency [16,27], though these approaches introduce algorithm versioning challenges and require prospective external validation before clinical deployment.</w:t>
+        <w:t>The adoption of volumetric measurement in clinical practice requires careful consideration of resource allocation and workflow integration. Manual segmentation, while accessible using free software platforms such as 3D Slicer, ITK-SNAP, Horos, and MNI-DISPLAY, demands substantial operator training and quality assurance protocols to achieve high inter-rater reliability (e.g., ICC &gt;0.90) [9]. For small centers managing fewer than 20 OPG patients annually, this approach remains feasible when paired with standardized protocols such as the Lambron method [20], which provides explicit radioanatomical landmarks, consistent measurement procedures, and training requirements that improved consistency, raising inter-rater agreement from a highly variable Kappa range of 0.11–1.0 to a more reliable 0.56–1.0 across multiple tumor characteristics. Conversely, large academic centers and multi-institutional trials may justify investment in semi-automated approaches or AI-assisted segmentation to improve efficiency [16,27], though these approaches introduce algorithm versioning challenges and require prospective external validation before clinical deployment.</w:t>
       </w:r>
     </w:p>
     <w:p>

</xml_diff>

<commit_message>
Update population percentages to match S1 classifications
NF1=29% → 18%, mixed=68% → 79% (sporadic 4% unchanged).
Aligned body text with Supplementary Table S1 population column.

Co-Authored-By: Claude Opus 4.6 <noreply@anthropic.com>
</commit_message>
<xml_diff>
--- a/Martin_OPG_Volumetric_Review_CORRECTED.docx
+++ b/Martin_OPG_Volumetric_Review_CORRECTED.docx
@@ -1165,7 +1165,35 @@
           <w:sz w:val="20"/>
           <w:szCs w:val="20"/>
         </w:rPr>
-        <w:t>Included studies were published between 2008 and 2025, with 75% (n=21) published after 2015. Geographic distribution included North America (43%), Europe (36%), Middle East (11%), Asia (7%), and South America (4%). Sample sizes ranged from 3 to 186 patients. Populations included NF1-associated OPG (29%), sporadic OPG (4%), and mixed (68%). MRI protocols varied across studies; most employed T1-weighted post-contrast sequences for volumetric analysis, though T2/FLAIR sequences were used in contrast-free surveillance protocols.</w:t>
+        <w:t>Included studies were published between 2008 and 2025, with 75% (n=21) published after 2015. Geographic distribution included North America (43%), Europe (36%), Middle East (11%), Asia (7%), and South America (4%). Sample sizes ranged from 3 to 186 patients. Populations included NF1-associated OPG (</w:t>
+      </w:r>
+      <w:r>
+        <w:rPr>
+          <w:sz w:val="20"/>
+          <w:szCs w:val="20"/>
+        </w:rPr>
+        <w:t>18</w:t>
+      </w:r>
+      <w:r>
+        <w:rPr>
+          <w:sz w:val="20"/>
+          <w:szCs w:val="20"/>
+        </w:rPr>
+        <w:t>%), sporadic OPG (4%), and mixed (</w:t>
+      </w:r>
+      <w:r>
+        <w:rPr>
+          <w:sz w:val="20"/>
+          <w:szCs w:val="20"/>
+        </w:rPr>
+        <w:t>79</w:t>
+      </w:r>
+      <w:r>
+        <w:rPr>
+          <w:sz w:val="20"/>
+          <w:szCs w:val="20"/>
+        </w:rPr>
+        <w:t>%). MRI protocols varied across studies; most employed T1-weighted post-contrast sequences for volumetric analysis, though T2/FLAIR sequences were used in contrast-free surveillance protocols.</w:t>
       </w:r>
     </w:p>
     <w:p>
@@ -1431,7 +1459,7 @@
           <w:sz w:val="20"/>
           <w:szCs w:val="20"/>
         </w:rPr>
-        <w:t xml:space="preserve"> measurements [30]. Notably, Lambron et al. [20] demonstrated improvement across multiple tumor characteristics from unacceptable pre-standardization reliability (Kappa </w:t>
+        <w:t xml:space="preserve"> measurements [30]. Notably, Lambron et al. [20] demonstrated </w:t>
       </w:r>
       <w:r>
         <w:rPr>
@@ -1439,7 +1467,7 @@
           <w:szCs w:val="20"/>
         </w:rPr>
         <w:lastRenderedPageBreak/>
-        <w:t>ranging from 0.11 to 1.0 depending on feature assessed) to acceptable post-standardization reliability (Kappa 0.56–1.0) following protocol implementation.</w:t>
+        <w:t>improvement across multiple tumor characteristics from unacceptable pre-standardization reliability (Kappa ranging from 0.11 to 1.0 depending on feature assessed) to acceptable post-standardization reliability (Kappa 0.56–1.0) following protocol implementation.</w:t>
       </w:r>
     </w:p>
     <w:p>
@@ -2248,6 +2276,7 @@
           <w:sz w:val="20"/>
           <w:szCs w:val="20"/>
         </w:rPr>
+        <w:lastRenderedPageBreak/>
         <w:t>prospective validation, particularly for diffuse chiasmatic tumors where conventional 2D measurements demonstrate 20% discordance with volumetric assessment [13]. NF1-associated OPGs exhibit distinct natural history patterns [15,19], suggesting that prognostic thresholds validated in sporadic tumors may require recalibration for this population.</w:t>
       </w:r>
     </w:p>
@@ -2983,6 +3012,7 @@
           <w:sz w:val="20"/>
           <w:szCs w:val="20"/>
         </w:rPr>
+        <w:lastRenderedPageBreak/>
         <w:t>Calixto EL, Ono SE, Teixeira BCAT, et al. Monitoring optochiasmatic-hypothalamic glioma volumetric changes by MRI in children under clinical surveillance or chemotherapy. Childs Nerv Syst. 2019;35(1):63-72.</w:t>
       </w:r>
     </w:p>
@@ -3193,6 +3223,7 @@
           <w:sz w:val="20"/>
           <w:szCs w:val="20"/>
         </w:rPr>
+        <w:lastRenderedPageBreak/>
         <w:t>Ludmir EB, Mahajan A, Paulino AC, et al. Increased risk of pseudoprogression among pediatric low-grade glioma patients treated with proton versus photon radiotherapy. Neuro Oncol. 2019;21(6):686-95.</w:t>
       </w:r>
     </w:p>
@@ -3472,8 +3503,8 @@
         <w:gridCol w:w="1846"/>
         <w:gridCol w:w="537"/>
         <w:gridCol w:w="1114"/>
-        <w:gridCol w:w="1237"/>
-        <w:gridCol w:w="1670"/>
+        <w:gridCol w:w="1844"/>
+        <w:gridCol w:w="2091"/>
       </w:tblGrid>
       <w:tr>
         <w:trPr>
@@ -3501,6 +3532,7 @@
                 <w:sz w:val="20"/>
                 <w:szCs w:val="20"/>
               </w:rPr>
+              <w:lastRenderedPageBreak/>
               <w:t>First Author (Year)</w:t>
             </w:r>
           </w:p>
@@ -3961,7 +3993,6 @@
                 <w:sz w:val="20"/>
                 <w:szCs w:val="20"/>
               </w:rPr>
-              <w:lastRenderedPageBreak/>
               <w:t>Avery (2023)</w:t>
             </w:r>
           </w:p>
@@ -5556,6 +5587,7 @@
           <w:sz w:val="20"/>
           <w:szCs w:val="20"/>
         </w:rPr>
+        <w:lastRenderedPageBreak/>
         <w:t>Table 2.</w:t>
       </w:r>
       <w:r>
@@ -5612,7 +5644,6 @@
                 <w:sz w:val="20"/>
                 <w:szCs w:val="20"/>
               </w:rPr>
-              <w:lastRenderedPageBreak/>
               <w:t>Study</w:t>
             </w:r>
           </w:p>
@@ -7028,6 +7059,7 @@
           <w:sz w:val="20"/>
           <w:szCs w:val="20"/>
         </w:rPr>
+        <w:lastRenderedPageBreak/>
         <w:pict w14:anchorId="6EC9DF75">
           <v:rect id="_x0000_i1035" style="width:0;height:1.5pt" o:hralign="center" o:hrstd="t" o:hr="t"/>
         </w:pict>
@@ -7055,7 +7087,6 @@
           <w:sz w:val="20"/>
           <w:szCs w:val="20"/>
         </w:rPr>
-        <w:lastRenderedPageBreak/>
         <w:t>Figure Legends</w:t>
       </w:r>
     </w:p>

</xml_diff>

<commit_message>
Fix Table 2 method labels, P80 citation, P84 percentage, Kelly 2013 software
Independent audit found 6 errors missed by prior session:
- Table 2: Bennebroek 2024b, Maloney 2021, Yeom 2013 method labels
  changed from "Manual" to "Approximation" (matches Table 1, S1, CSV)
- P80: Citation [9] -> [10] after ICC >0.90 (Bennebroek 2024a has no ICC;
  2024b [10] reports ICC 0.96)
- P84: Automated percentage 7% -> 8% (matches abstract and body text;
  2/26 = 7.7% rounds to 8%)
- S1: Kelly 2013 software N/A -> ITK-SNAP (matches CSV ground truth)

Co-Authored-By: Claude Opus 4.6 <noreply@anthropic.com>
</commit_message>
<xml_diff>
--- a/Martin_OPG_Volumetric_Review_CORRECTED.docx
+++ b/Martin_OPG_Volumetric_Review_CORRECTED.docx
@@ -2224,7 +2224,7 @@
           <w:sz w:val="20"/>
           <w:szCs w:val="20"/>
         </w:rPr>
-        <w:t>The adoption of volumetric measurement in clinical practice requires careful consideration of resource allocation and workflow integration. Manual segmentation, while accessible using free software platforms such as 3D Slicer, ITK-SNAP, Horos, and MNI-DISPLAY, demands substantial operator training and quality assurance protocols to achieve high inter-rater reliability (e.g., ICC &gt;0.90) [9]. For small centers managing fewer than 20 OPG patients annually, this approach remains feasible when paired with standardized protocols such as the Lambron method [20], which provides explicit radioanatomical landmarks, consistent measurement procedures, and training requirements that improved consistency, raising inter-rater agreement from a highly variable Kappa range of 0.11–1.0 to a more reliable 0.56–1.0 across multiple tumor characteristics. Conversely, large academic centers and multi-institutional trials may justify investment in semi-automated approaches or AI-assisted segmentation to improve efficiency [16,27], though these approaches introduce algorithm versioning challenges and require prospective external validation before clinical deployment.</w:t>
+        <w:t>The adoption of volumetric measurement in clinical practice requires careful consideration of resource allocation and workflow integration. Manual segmentation, while accessible using free software platforms such as 3D Slicer, ITK-SNAP, Horos, and MNI-DISPLAY, demands substantial operator training and quality assurance protocols to achieve high inter-rater reliability (e.g., ICC &gt;0.90) [10]. For small centers managing fewer than 20 OPG patients annually, this approach remains feasible when paired with standardized protocols such as the Lambron method [20], which provides explicit radioanatomical landmarks, consistent measurement procedures, and training requirements that improved consistency, raising inter-rater agreement from a highly variable Kappa range of 0.11–1.0 to a more reliable 0.56–1.0 across multiple tumor characteristics. Conversely, large academic centers and multi-institutional trials may justify investment in semi-automated approaches or AI-assisted segmentation to improve efficiency [16,27], though these approaches introduce algorithm versioning challenges and require prospective external validation before clinical deployment.</w:t>
       </w:r>
     </w:p>
     <w:p>
@@ -2319,7 +2319,7 @@
           <w:sz w:val="20"/>
           <w:szCs w:val="20"/>
         </w:rPr>
-        <w:t>This review has several limitations: lack of prospective protocol registration; single-reviewer screening and selection increases risk of selection bias and missed relevant studies; methodological heterogeneity precluded meta-analysis; formal quality assessment was not performed per PRISMA-ScR guidance; and rapidly evolving AI methods may outpace these findings. In particular, the exclusion of conference proceedings likely underrepresents fully automated deep learning approaches (only 2 of 26 studies, 7%), which are often first reported at specialized venues (MICCAI, SPIE Medical Imaging) before peer-reviewed publication.</w:t>
+        <w:t>This review has several limitations: lack of prospective protocol registration; single-reviewer screening and selection increases risk of selection bias and missed relevant studies; methodological heterogeneity precluded meta-analysis; formal quality assessment was not performed per PRISMA-ScR guidance; and rapidly evolving AI methods may outpace these findings. In particular, the exclusion of conference proceedings likely underrepresents fully automated deep learning approaches (only 2 of 26 studies, 8%), which are often first reported at specialized venues (MICCAI, SPIE Medical Imaging) before peer-reviewed publication.</w:t>
       </w:r>
     </w:p>
     <w:p>
@@ -5765,7 +5765,7 @@
                 <w:sz w:val="20"/>
                 <w:szCs w:val="20"/>
               </w:rPr>
-              <w:t>Manual</w:t>
+              <w:t>Approximation</w:t>
             </w:r>
           </w:p>
         </w:tc>
@@ -5945,7 +5945,7 @@
                 <w:sz w:val="20"/>
                 <w:szCs w:val="20"/>
               </w:rPr>
-              <w:t>Manual</w:t>
+              <w:t>Approximation</w:t>
             </w:r>
           </w:p>
         </w:tc>
@@ -6125,7 +6125,7 @@
                 <w:sz w:val="20"/>
                 <w:szCs w:val="20"/>
               </w:rPr>
-              <w:t>Manual (ADC)</w:t>
+              <w:t>Approximation (ADC)</w:t>
             </w:r>
           </w:p>
         </w:tc>

</xml_diff>